<commit_message>
Admin sửa / hủy lệnh sản xuất (không xóa cứng, hoàn phụ liệu, trừ thành phẩm)
Co-Authored-By: Claude Opus 5.5 <noreply@anthropic.com>
</commit_message>
<xml_diff>
--- a/Huong-dan-su-dung-Walenty.docx
+++ b/Huong-dan-su-dung-Walenty.docx
@@ -880,6 +880,112 @@
                 <w:sz w:val="20"/>
                 <w:szCs w:val="20"/>
               </w:rPr>
+              <w:t xml:space="preserve">Sửa / hủy lệnh</w:t>
+            </w:r>
+          </w:p>
+        </w:tc>
+        <w:tc>
+          <w:tcPr>
+            <w:tcW w:type="dxa" w:w="1800"/>
+            <w:tcMar>
+              <w:top w:type="dxa" w:w="80"/>
+              <w:left w:type="dxa" w:w="100"/>
+              <w:bottom w:type="dxa" w:w="80"/>
+              <w:right w:type="dxa" w:w="100"/>
+            </w:tcMar>
+          </w:tcPr>
+          <w:p>
+            <w:pPr>
+              <w:spacing w:after="0" w:line="270"/>
+            </w:pPr>
+            <w:r>
+              <w:rPr>
+                <w:rFonts w:ascii="Arial" w:cs="Arial" w:eastAsia="Arial" w:hAnsi="Arial"/>
+                <w:b w:val="false"/>
+                <w:bCs w:val="false"/>
+                <w:sz w:val="20"/>
+                <w:szCs w:val="20"/>
+              </w:rPr>
+              <w:t xml:space="preserve">✓</w:t>
+            </w:r>
+          </w:p>
+        </w:tc>
+        <w:tc>
+          <w:tcPr>
+            <w:tcW w:type="dxa" w:w="1800"/>
+            <w:tcMar>
+              <w:top w:type="dxa" w:w="80"/>
+              <w:left w:type="dxa" w:w="100"/>
+              <w:bottom w:type="dxa" w:w="80"/>
+              <w:right w:type="dxa" w:w="100"/>
+            </w:tcMar>
+          </w:tcPr>
+          <w:p>
+            <w:pPr>
+              <w:spacing w:after="0" w:line="270"/>
+            </w:pPr>
+            <w:r>
+              <w:rPr>
+                <w:rFonts w:ascii="Arial" w:cs="Arial" w:eastAsia="Arial" w:hAnsi="Arial"/>
+                <w:b w:val="false"/>
+                <w:bCs w:val="false"/>
+                <w:sz w:val="20"/>
+                <w:szCs w:val="20"/>
+              </w:rPr>
+              <w:t xml:space="preserve">—</w:t>
+            </w:r>
+          </w:p>
+        </w:tc>
+        <w:tc>
+          <w:tcPr>
+            <w:tcW w:type="dxa" w:w="1800"/>
+            <w:tcMar>
+              <w:top w:type="dxa" w:w="80"/>
+              <w:left w:type="dxa" w:w="100"/>
+              <w:bottom w:type="dxa" w:w="80"/>
+              <w:right w:type="dxa" w:w="100"/>
+            </w:tcMar>
+          </w:tcPr>
+          <w:p>
+            <w:pPr>
+              <w:spacing w:after="0" w:line="270"/>
+            </w:pPr>
+            <w:r>
+              <w:rPr>
+                <w:rFonts w:ascii="Arial" w:cs="Arial" w:eastAsia="Arial" w:hAnsi="Arial"/>
+                <w:b w:val="false"/>
+                <w:bCs w:val="false"/>
+                <w:sz w:val="20"/>
+                <w:szCs w:val="20"/>
+              </w:rPr>
+              <w:t xml:space="preserve">—</w:t>
+            </w:r>
+          </w:p>
+        </w:tc>
+      </w:tr>
+      <w:tr>
+        <w:tc>
+          <w:tcPr>
+            <w:tcW w:type="dxa" w:w="3960"/>
+            <w:tcMar>
+              <w:top w:type="dxa" w:w="80"/>
+              <w:left w:type="dxa" w:w="100"/>
+              <w:bottom w:type="dxa" w:w="80"/>
+              <w:right w:type="dxa" w:w="100"/>
+            </w:tcMar>
+          </w:tcPr>
+          <w:p>
+            <w:pPr>
+              <w:spacing w:after="0" w:line="270"/>
+            </w:pPr>
+            <w:r>
+              <w:rPr>
+                <w:rFonts w:ascii="Arial" w:cs="Arial" w:eastAsia="Arial" w:hAnsi="Arial"/>
+                <w:b w:val="false"/>
+                <w:bCs w:val="false"/>
+                <w:sz w:val="20"/>
+                <w:szCs w:val="20"/>
+              </w:rPr>
               <w:t xml:space="preserve">QC, phiếu trả sửa</w:t>
             </w:r>
           </w:p>
@@ -4625,6 +4731,175 @@
           <w:szCs w:val="22"/>
         </w:rPr>
         <w:t xml:space="preserve">. Xưởng trả nhiều đợt thì nhận nhiều lần, mỗi đợt QC riêng.</w:t>
+      </w:r>
+    </w:p>
+    <w:p>
+      <w:pPr>
+        <w:pStyle w:val="Heading3"/>
+        <w:spacing w:after="80" w:before="200"/>
+      </w:pPr>
+      <w:r>
+        <w:rPr>
+          <w:rFonts w:ascii="Arial" w:cs="Arial" w:eastAsia="Arial" w:hAnsi="Arial"/>
+          <w:b/>
+          <w:bCs/>
+          <w:color w:val="785837"/>
+          <w:sz w:val="23"/>
+          <w:szCs w:val="23"/>
+        </w:rPr>
+        <w:t xml:space="preserve">Sửa hoặc hủy lệnh (chỉ Quản lý kho)</w:t>
+      </w:r>
+    </w:p>
+    <w:p>
+      <w:pPr>
+        <w:spacing w:after="120" w:line="300"/>
+      </w:pPr>
+      <w:r>
+        <w:rPr>
+          <w:rFonts w:ascii="Arial" w:cs="Arial" w:eastAsia="Arial" w:hAnsi="Arial"/>
+          <w:sz w:val="22"/>
+          <w:szCs w:val="22"/>
+        </w:rPr>
+        <w:t xml:space="preserve">Lệnh tạo sai thì Quản lý kho mở chi tiết lệnh, dùng 2 nút ở góc trên bên phải:</w:t>
+      </w:r>
+    </w:p>
+    <w:p>
+      <w:pPr>
+        <w:pStyle w:val="ListParagraph"/>
+        <w:numPr>
+          <w:ilvl w:val="0"/>
+          <w:numId w:val="3"/>
+        </w:numPr>
+        <w:spacing w:after="60" w:line="290"/>
+      </w:pPr>
+      <w:r>
+        <w:rPr>
+          <w:rFonts w:ascii="Arial" w:cs="Arial" w:eastAsia="Arial" w:hAnsi="Arial"/>
+          <w:b/>
+          <w:bCs/>
+          <w:sz w:val="22"/>
+          <w:szCs w:val="22"/>
+        </w:rPr>
+        <w:t xml:space="preserve">Sửa lệnh:</w:t>
+      </w:r>
+      <w:r>
+        <w:rPr>
+          <w:rFonts w:ascii="Arial" w:cs="Arial" w:eastAsia="Arial" w:hAnsi="Arial"/>
+          <w:sz w:val="22"/>
+          <w:szCs w:val="22"/>
+        </w:rPr>
+        <w:t xml:space="preserve"> lệnh chưa cắt thì đổi được xưởng, ngày dự kiến, số lượng từng size (phụ liệu tự xuất thêm hoặc hoàn lại phần chênh lệch). Lệnh đã cắt chỉ đổi được ngày dự kiến.</w:t>
+      </w:r>
+    </w:p>
+    <w:p>
+      <w:pPr>
+        <w:pStyle w:val="ListParagraph"/>
+        <w:numPr>
+          <w:ilvl w:val="0"/>
+          <w:numId w:val="3"/>
+        </w:numPr>
+        <w:spacing w:after="60" w:line="290"/>
+      </w:pPr>
+      <w:r>
+        <w:rPr>
+          <w:rFonts w:ascii="Arial" w:cs="Arial" w:eastAsia="Arial" w:hAnsi="Arial"/>
+          <w:b/>
+          <w:bCs/>
+          <w:sz w:val="22"/>
+          <w:szCs w:val="22"/>
+        </w:rPr>
+        <w:t xml:space="preserve">Hủy lệnh:</w:t>
+      </w:r>
+      <w:r>
+        <w:rPr>
+          <w:rFonts w:ascii="Arial" w:cs="Arial" w:eastAsia="Arial" w:hAnsi="Arial"/>
+          <w:sz w:val="22"/>
+          <w:szCs w:val="22"/>
+        </w:rPr>
+        <w:t xml:space="preserve"> ghi lý do (bắt buộc), chọn có </w:t>
+      </w:r>
+      <w:r>
+        <w:rPr>
+          <w:rFonts w:ascii="Arial" w:cs="Arial" w:eastAsia="Arial" w:hAnsi="Arial"/>
+          <w:b/>
+          <w:bCs/>
+          <w:sz w:val="22"/>
+          <w:szCs w:val="22"/>
+        </w:rPr>
+        <w:t xml:space="preserve">hoàn phụ liệu về kho</w:t>
+      </w:r>
+      <w:r>
+        <w:rPr>
+          <w:rFonts w:ascii="Arial" w:cs="Arial" w:eastAsia="Arial" w:hAnsi="Arial"/>
+          <w:sz w:val="22"/>
+          <w:szCs w:val="22"/>
+        </w:rPr>
+        <w:t xml:space="preserve"> không và có </w:t>
+      </w:r>
+      <w:r>
+        <w:rPr>
+          <w:rFonts w:ascii="Arial" w:cs="Arial" w:eastAsia="Arial" w:hAnsi="Arial"/>
+          <w:b/>
+          <w:bCs/>
+          <w:sz w:val="22"/>
+          <w:szCs w:val="22"/>
+        </w:rPr>
+        <w:t xml:space="preserve">trừ thành phẩm</w:t>
+      </w:r>
+      <w:r>
+        <w:rPr>
+          <w:rFonts w:ascii="Arial" w:cs="Arial" w:eastAsia="Arial" w:hAnsi="Arial"/>
+          <w:sz w:val="22"/>
+          <w:szCs w:val="22"/>
+        </w:rPr>
+        <w:t xml:space="preserve"> đã nhập từ lệnh đó không. Lệnh đã hủy không bị xóa hẳn: bấm </w:t>
+      </w:r>
+      <w:r>
+        <w:rPr>
+          <w:rFonts w:ascii="Arial" w:cs="Arial" w:eastAsia="Arial" w:hAnsi="Arial"/>
+          <w:b/>
+          <w:bCs/>
+          <w:sz w:val="22"/>
+          <w:szCs w:val="22"/>
+        </w:rPr>
+        <w:t xml:space="preserve">Xem lệnh đã hủy</w:t>
+      </w:r>
+      <w:r>
+        <w:rPr>
+          <w:rFonts w:ascii="Arial" w:cs="Arial" w:eastAsia="Arial" w:hAnsi="Arial"/>
+          <w:sz w:val="22"/>
+          <w:szCs w:val="22"/>
+        </w:rPr>
+        <w:t xml:space="preserve"> ở trang Lệnh sản xuất để xem lại.</w:t>
+      </w:r>
+    </w:p>
+    <w:p>
+      <w:pPr>
+        <w:pBdr>
+          <w:left w:val="single" w:color="5E1117" w:sz="18" w:space="8"/>
+        </w:pBdr>
+        <w:shd w:fill="F7E3E1" w:color="auto" w:val="clear"/>
+        <w:spacing w:after="160" w:before="120" w:line="290"/>
+        <w:ind w:left="120" w:right="120"/>
+      </w:pPr>
+      <w:r>
+        <w:rPr>
+          <w:rFonts w:ascii="Arial" w:cs="Arial" w:eastAsia="Arial" w:hAnsi="Arial"/>
+          <w:b/>
+          <w:bCs/>
+          <w:color w:val="5E1117"/>
+          <w:sz w:val="22"/>
+          <w:szCs w:val="22"/>
+        </w:rPr>
+        <w:t xml:space="preserve">Lưu ý: </w:t>
+      </w:r>
+      <w:r>
+        <w:rPr>
+          <w:rFonts w:ascii="Arial" w:cs="Arial" w:eastAsia="Arial" w:hAnsi="Arial"/>
+          <w:sz w:val="22"/>
+          <w:szCs w:val="22"/>
+        </w:rPr>
+        <w:t xml:space="preserve">Phó kho và Team QC không thấy 2 nút này. Mọi lần sửa / hủy đều ghi vào Lịch sử thao tác.</w:t>
       </w:r>
     </w:p>
     <w:p>

</xml_diff>